<commit_message>
GUI and Backend work
</commit_message>
<xml_diff>
--- a/config/templates/Cover_Letter_Template.docx
+++ b/config/templates/Cover_Letter_Template.docx
@@ -177,20 +177,6 @@
       <w:r>
         <w:rPr>
           <w:rFonts w:ascii="Times New Roman" w:hAnsi="Times New Roman" w:cs="Times New Roman"/>
-        </w:rPr>
-        <w:br/>
-      </w:r>
-      <w:r>
-        <w:rPr>
-          <w:rFonts w:ascii="Times New Roman" w:hAnsi="Times New Roman" w:cs="Times New Roman"/>
-          <w:sz w:val="22"/>
-          <w:szCs w:val="22"/>
-        </w:rPr>
-        <w:t>{{ date }}</w:t>
-      </w:r>
-      <w:r>
-        <w:rPr>
-          <w:rFonts w:ascii="Times New Roman" w:hAnsi="Times New Roman" w:cs="Times New Roman"/>
           <w:sz w:val="22"/>
           <w:szCs w:val="22"/>
         </w:rPr>
@@ -221,6 +207,22 @@
         </w:rPr>
         <w:br/>
         <w:t>{{ company address }}</w:t>
+      </w:r>
+      <w:r>
+        <w:rPr>
+          <w:rFonts w:ascii="Times New Roman" w:hAnsi="Times New Roman" w:cs="Times New Roman"/>
+          <w:sz w:val="22"/>
+          <w:szCs w:val="22"/>
+        </w:rPr>
+        <w:br/>
+      </w:r>
+      <w:r>
+        <w:rPr>
+          <w:rFonts w:ascii="Times New Roman" w:hAnsi="Times New Roman" w:cs="Times New Roman"/>
+          <w:sz w:val="22"/>
+          <w:szCs w:val="22"/>
+        </w:rPr>
+        <w:t>{{ date }}</w:t>
       </w:r>
     </w:p>
     <w:p>
@@ -399,7 +401,23 @@
           <w:sz w:val="22"/>
           <w:szCs w:val="22"/>
         </w:rPr>
-        <w:t xml:space="preserve">Beyond the technical side, my time as a {{ previous_job_title }} taught me {{ work_experience_lesson }}. </w:t>
+        <w:t>Beyond the technical side, my time as a</w:t>
+      </w:r>
+      <w:r>
+        <w:rPr>
+          <w:rFonts w:ascii="Times New Roman" w:hAnsi="Times New Roman" w:cs="Times New Roman"/>
+          <w:sz w:val="22"/>
+          <w:szCs w:val="22"/>
+        </w:rPr>
+        <w:t>n</w:t>
+      </w:r>
+      <w:r>
+        <w:rPr>
+          <w:rFonts w:ascii="Times New Roman" w:hAnsi="Times New Roman" w:cs="Times New Roman"/>
+          <w:sz w:val="22"/>
+          <w:szCs w:val="22"/>
+        </w:rPr>
+        <w:t xml:space="preserve"> {{ previous_job_title }} taught me {{ work_experience_lesson }}. </w:t>
       </w:r>
       <w:r>
         <w:rPr>

</xml_diff>